<commit_message>
fix [worksheet - w3]
</commit_message>
<xml_diff>
--- a/1-G-1/3-week-3/4-worksheet/Computer Worksheet G1 W3 (Answer).docx
+++ b/1-G-1/3-week-3/4-worksheet/Computer Worksheet G1 W3 (Answer).docx
@@ -4,7 +4,7 @@
   <w:body>
     <w:tbl>
       <w:tblPr>
-        <w:tblStyle w:val="a6"/>
+        <w:tblStyle w:val="TableGrid"/>
         <w:tblpPr w:leftFromText="180" w:rightFromText="180" w:vertAnchor="text" w:horzAnchor="margin" w:tblpY="565"/>
         <w:tblW w:w="0" w:type="auto"/>
         <w:tblBorders>
@@ -452,6 +452,26 @@
         <w:t xml:space="preserve">  )</w:t>
       </w:r>
       <w:proofErr w:type="gramEnd"/>
+      <w:r>
+        <w:rPr>
+          <w:rFonts w:ascii="Lucida Bright" w:hAnsi="Lucida Bright"/>
+          <w:b/>
+          <w:bCs/>
+          <w:sz w:val="36"/>
+          <w:szCs w:val="36"/>
+        </w:rPr>
+        <w:t xml:space="preserve"> </w:t>
+      </w:r>
+      <w:r>
+        <w:rPr>
+          <w:rFonts w:ascii="Lucida Bright" w:hAnsi="Lucida Bright"/>
+          <w:b/>
+          <w:bCs/>
+          <w:sz w:val="36"/>
+          <w:szCs w:val="36"/>
+        </w:rPr>
+        <w:t>(Answer)</w:t>
+      </w:r>
     </w:p>
     <w:p>
       <w:pPr>
@@ -499,8 +519,142 @@
           <w:sz w:val="36"/>
           <w:szCs w:val="36"/>
         </w:rPr>
+        <mc:AlternateContent>
+          <mc:Choice Requires="wps">
+            <w:drawing>
+              <wp:anchor distT="45720" distB="45720" distL="114300" distR="114300" simplePos="0" relativeHeight="251645952" behindDoc="0" locked="0" layoutInCell="1" allowOverlap="1" wp14:anchorId="20D99B0E" wp14:editId="78882D37">
+                <wp:simplePos x="0" y="0"/>
+                <wp:positionH relativeFrom="column">
+                  <wp:posOffset>1958975</wp:posOffset>
+                </wp:positionH>
+                <wp:positionV relativeFrom="paragraph">
+                  <wp:posOffset>5500370</wp:posOffset>
+                </wp:positionV>
+                <wp:extent cx="2360930" cy="1404620"/>
+                <wp:effectExtent l="0" t="0" r="19050" b="24130"/>
+                <wp:wrapNone/>
+                <wp:docPr id="217" name="Text Box 2"/>
+                <wp:cNvGraphicFramePr>
+                  <a:graphicFrameLocks xmlns:a="http://schemas.openxmlformats.org/drawingml/2006/main"/>
+                </wp:cNvGraphicFramePr>
+                <a:graphic xmlns:a="http://schemas.openxmlformats.org/drawingml/2006/main">
+                  <a:graphicData uri="http://schemas.microsoft.com/office/word/2010/wordprocessingShape">
+                    <wps:wsp>
+                      <wps:cNvSpPr txBox="1">
+                        <a:spLocks noChangeArrowheads="1"/>
+                      </wps:cNvSpPr>
+                      <wps:spPr bwMode="auto">
+                        <a:xfrm>
+                          <a:off x="0" y="0"/>
+                          <a:ext cx="2360930" cy="1404620"/>
+                        </a:xfrm>
+                        <a:prstGeom prst="rect">
+                          <a:avLst/>
+                        </a:prstGeom>
+                        <a:solidFill>
+                          <a:srgbClr val="FFFFFF"/>
+                        </a:solidFill>
+                        <a:ln w="9525">
+                          <a:solidFill>
+                            <a:srgbClr val="000000"/>
+                          </a:solidFill>
+                          <a:miter lim="800000"/>
+                          <a:headEnd/>
+                          <a:tailEnd/>
+                        </a:ln>
+                      </wps:spPr>
+                      <wps:txbx>
+                        <w:txbxContent>
+                          <w:p>
+                            <w:pPr>
+                              <w:bidi w:val="0"/>
+                              <w:jc w:val="center"/>
+                              <w:rPr>
+                                <w:rFonts w:ascii="Lucida Bright" w:hAnsi="Lucida Bright"/>
+                                <w:b/>
+                                <w:bCs/>
+                                <w:sz w:val="72"/>
+                                <w:szCs w:val="72"/>
+                              </w:rPr>
+                            </w:pPr>
+                            <w:r>
+                              <w:rPr>
+                                <w:rFonts w:ascii="Lucida Bright" w:hAnsi="Lucida Bright"/>
+                                <w:b/>
+                                <w:bCs/>
+                                <w:sz w:val="72"/>
+                                <w:szCs w:val="72"/>
+                              </w:rPr>
+                              <w:t>Good Luck</w:t>
+                            </w:r>
+                          </w:p>
+                          <w:p/>
+                        </w:txbxContent>
+                      </wps:txbx>
+                      <wps:bodyPr rot="0" vert="horz" wrap="square" lIns="91440" tIns="45720" rIns="91440" bIns="45720" anchor="t" anchorCtr="0">
+                        <a:spAutoFit/>
+                      </wps:bodyPr>
+                    </wps:wsp>
+                  </a:graphicData>
+                </a:graphic>
+                <wp14:sizeRelH relativeFrom="margin">
+                  <wp14:pctWidth>40000</wp14:pctWidth>
+                </wp14:sizeRelH>
+                <wp14:sizeRelV relativeFrom="margin">
+                  <wp14:pctHeight>20000</wp14:pctHeight>
+                </wp14:sizeRelV>
+              </wp:anchor>
+            </w:drawing>
+          </mc:Choice>
+          <mc:Fallback>
+            <w:pict>
+              <v:shapetype w14:anchorId="20D99B0E" id="_x0000_t202" coordsize="21600,21600" o:spt="202" path="m,l,21600r21600,l21600,xe">
+                <v:stroke joinstyle="miter"/>
+                <v:path gradientshapeok="t" o:connecttype="rect"/>
+              </v:shapetype>
+              <v:shape id="Text Box 2" o:spid="_x0000_s1026" type="#_x0000_t202" style="position:absolute;margin-left:154.25pt;margin-top:433.1pt;width:185.9pt;height:110.6pt;z-index:251645952;visibility:visible;mso-wrap-style:square;mso-width-percent:400;mso-height-percent:200;mso-wrap-distance-left:9pt;mso-wrap-distance-top:3.6pt;mso-wrap-distance-right:9pt;mso-wrap-distance-bottom:3.6pt;mso-position-horizontal:absolute;mso-position-horizontal-relative:text;mso-position-vertical:absolute;mso-position-vertical-relative:text;mso-width-percent:400;mso-height-percent:200;mso-width-relative:margin;mso-height-relative:margin;v-text-anchor:top" o:gfxdata="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">
+                <v:textbox style="mso-fit-shape-to-text:t">
+                  <w:txbxContent>
+                    <w:p>
+                      <w:pPr>
+                        <w:bidi w:val="0"/>
+                        <w:jc w:val="center"/>
+                        <w:rPr>
+                          <w:rFonts w:ascii="Lucida Bright" w:hAnsi="Lucida Bright"/>
+                          <w:b/>
+                          <w:bCs/>
+                          <w:sz w:val="72"/>
+                          <w:szCs w:val="72"/>
+                        </w:rPr>
+                      </w:pPr>
+                      <w:r>
+                        <w:rPr>
+                          <w:rFonts w:ascii="Lucida Bright" w:hAnsi="Lucida Bright"/>
+                          <w:b/>
+                          <w:bCs/>
+                          <w:sz w:val="72"/>
+                          <w:szCs w:val="72"/>
+                        </w:rPr>
+                        <w:t>Good Luck</w:t>
+                      </w:r>
+                    </w:p>
+                    <w:p/>
+                  </w:txbxContent>
+                </v:textbox>
+              </v:shape>
+            </w:pict>
+          </mc:Fallback>
+        </mc:AlternateContent>
+      </w:r>
+      <w:r>
+        <w:rPr>
+          <w:rFonts w:ascii="Lucida Bright" w:hAnsi="Lucida Bright"/>
+          <w:noProof/>
+          <w:sz w:val="36"/>
+          <w:szCs w:val="36"/>
+        </w:rPr>
         <w:drawing>
-          <wp:anchor distT="0" distB="0" distL="114300" distR="114300" simplePos="0" relativeHeight="251651584" behindDoc="0" locked="0" layoutInCell="1" allowOverlap="1" wp14:anchorId="58954433" wp14:editId="50088A32">
+          <wp:anchor distT="0" distB="0" distL="114300" distR="114300" simplePos="0" relativeHeight="251650048" behindDoc="0" locked="0" layoutInCell="1" allowOverlap="1" wp14:anchorId="58954433" wp14:editId="50088A32">
             <wp:simplePos x="0" y="0"/>
             <wp:positionH relativeFrom="column">
               <wp:posOffset>711200</wp:posOffset>
@@ -573,7 +727,7 @@
         <mc:AlternateContent>
           <mc:Choice Requires="wps">
             <w:drawing>
-              <wp:anchor distT="45720" distB="45720" distL="114300" distR="114300" simplePos="0" relativeHeight="251663872" behindDoc="0" locked="0" layoutInCell="1" allowOverlap="1" wp14:anchorId="7A5032F6" wp14:editId="5BEFB012">
+              <wp:anchor distT="45720" distB="45720" distL="114300" distR="114300" simplePos="0" relativeHeight="251666432" behindDoc="0" locked="0" layoutInCell="1" allowOverlap="1" wp14:anchorId="7A5032F6" wp14:editId="5BEFB012">
                 <wp:simplePos x="0" y="0"/>
                 <wp:positionH relativeFrom="column">
                   <wp:posOffset>76200</wp:posOffset>
@@ -655,11 +809,7 @@
           </mc:Choice>
           <mc:Fallback>
             <w:pict>
-              <v:shapetype w14:anchorId="7A5032F6" id="_x0000_t202" coordsize="21600,21600" o:spt="202" path="m,l,21600r21600,l21600,xe">
-                <v:stroke joinstyle="miter"/>
-                <v:path gradientshapeok="t" o:connecttype="rect"/>
-              </v:shapetype>
-              <v:shape id="مربع نص 2" o:spid="_x0000_s1026" type="#_x0000_t202" style="position:absolute;margin-left:6pt;margin-top:367.7pt;width:185.9pt;height:110.6pt;flip:x;z-index:251663872;visibility:visible;mso-wrap-style:square;mso-width-percent:400;mso-height-percent:200;mso-wrap-distance-left:9pt;mso-wrap-distance-top:3.6pt;mso-wrap-distance-right:9pt;mso-wrap-distance-bottom:3.6pt;mso-position-horizontal:absolute;mso-position-horizontal-relative:text;mso-position-vertical:absolute;mso-position-vertical-relative:text;mso-width-percent:400;mso-height-percent:200;mso-width-relative:margin;mso-height-relative:margin;v-text-anchor:top" o:gfxdata="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" stroked="f">
+              <v:shape w14:anchorId="7A5032F6" id="مربع نص 2" o:spid="_x0000_s1027" type="#_x0000_t202" style="position:absolute;margin-left:6pt;margin-top:367.7pt;width:185.9pt;height:110.6pt;flip:x;z-index:251666432;visibility:visible;mso-wrap-style:square;mso-width-percent:400;mso-height-percent:200;mso-wrap-distance-left:9pt;mso-wrap-distance-top:3.6pt;mso-wrap-distance-right:9pt;mso-wrap-distance-bottom:3.6pt;mso-position-horizontal:absolute;mso-position-horizontal-relative:text;mso-position-vertical:absolute;mso-position-vertical-relative:text;mso-width-percent:400;mso-height-percent:200;mso-width-relative:margin;mso-height-relative:margin;v-text-anchor:top" o:gfxdata="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" stroked="f">
                 <v:textbox style="mso-fit-shape-to-text:t">
                   <w:txbxContent>
                     <w:p>
@@ -703,7 +853,7 @@
         <mc:AlternateContent>
           <mc:Choice Requires="wps">
             <w:drawing>
-              <wp:anchor distT="45720" distB="45720" distL="114300" distR="114300" simplePos="0" relativeHeight="251666944" behindDoc="0" locked="0" layoutInCell="1" allowOverlap="1" wp14:anchorId="03E78187" wp14:editId="31905169">
+              <wp:anchor distT="45720" distB="45720" distL="114300" distR="114300" simplePos="0" relativeHeight="251668480" behindDoc="0" locked="0" layoutInCell="1" allowOverlap="1" wp14:anchorId="03E78187" wp14:editId="31905169">
                 <wp:simplePos x="0" y="0"/>
                 <wp:positionH relativeFrom="column">
                   <wp:posOffset>3954145</wp:posOffset>
@@ -785,7 +935,7 @@
           </mc:Choice>
           <mc:Fallback>
             <w:pict>
-              <v:shape w14:anchorId="03E78187" id="_x0000_s1027" type="#_x0000_t202" style="position:absolute;margin-left:311.35pt;margin-top:364.35pt;width:185.9pt;height:110.6pt;flip:x;z-index:251666944;visibility:visible;mso-wrap-style:square;mso-width-percent:400;mso-height-percent:200;mso-wrap-distance-left:9pt;mso-wrap-distance-top:3.6pt;mso-wrap-distance-right:9pt;mso-wrap-distance-bottom:3.6pt;mso-position-horizontal:absolute;mso-position-horizontal-relative:text;mso-position-vertical:absolute;mso-position-vertical-relative:text;mso-width-percent:400;mso-height-percent:200;mso-width-relative:margin;mso-height-relative:margin;v-text-anchor:top" o:gfxdata="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" stroked="f">
+              <v:shape w14:anchorId="03E78187" id="_x0000_s1028" type="#_x0000_t202" style="position:absolute;margin-left:311.35pt;margin-top:364.35pt;width:185.9pt;height:110.6pt;flip:x;z-index:251668480;visibility:visible;mso-wrap-style:square;mso-width-percent:400;mso-height-percent:200;mso-wrap-distance-left:9pt;mso-wrap-distance-top:3.6pt;mso-wrap-distance-right:9pt;mso-wrap-distance-bottom:3.6pt;mso-position-horizontal:absolute;mso-position-horizontal-relative:text;mso-position-vertical:absolute;mso-position-vertical-relative:text;mso-width-percent:400;mso-height-percent:200;mso-width-relative:margin;mso-height-relative:margin;v-text-anchor:top" o:gfxdata="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" stroked="f">
                 <v:textbox style="mso-fit-shape-to-text:t">
                   <w:txbxContent>
                     <w:p>
@@ -829,7 +979,7 @@
         <mc:AlternateContent>
           <mc:Choice Requires="wps">
             <w:drawing>
-              <wp:anchor distT="45720" distB="45720" distL="114300" distR="114300" simplePos="0" relativeHeight="251660800" behindDoc="0" locked="0" layoutInCell="1" allowOverlap="1" wp14:anchorId="102BFB16" wp14:editId="724A20AF">
+              <wp:anchor distT="45720" distB="45720" distL="114300" distR="114300" simplePos="0" relativeHeight="251664384" behindDoc="0" locked="0" layoutInCell="1" allowOverlap="1" wp14:anchorId="102BFB16" wp14:editId="724A20AF">
                 <wp:simplePos x="0" y="0"/>
                 <wp:positionH relativeFrom="column">
                   <wp:posOffset>3990975</wp:posOffset>
@@ -911,7 +1061,7 @@
           </mc:Choice>
           <mc:Fallback>
             <w:pict>
-              <v:shape w14:anchorId="102BFB16" id="_x0000_s1028" type="#_x0000_t202" style="position:absolute;margin-left:314.25pt;margin-top:200.1pt;width:185.9pt;height:110.6pt;flip:x;z-index:251660800;visibility:visible;mso-wrap-style:square;mso-width-percent:400;mso-height-percent:200;mso-wrap-distance-left:9pt;mso-wrap-distance-top:3.6pt;mso-wrap-distance-right:9pt;mso-wrap-distance-bottom:3.6pt;mso-position-horizontal:absolute;mso-position-horizontal-relative:text;mso-position-vertical:absolute;mso-position-vertical-relative:text;mso-width-percent:400;mso-height-percent:200;mso-width-relative:margin;mso-height-relative:margin;v-text-anchor:top" o:gfxdata="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" stroked="f">
+              <v:shape w14:anchorId="102BFB16" id="_x0000_s1029" type="#_x0000_t202" style="position:absolute;margin-left:314.25pt;margin-top:200.1pt;width:185.9pt;height:110.6pt;flip:x;z-index:251664384;visibility:visible;mso-wrap-style:square;mso-width-percent:400;mso-height-percent:200;mso-wrap-distance-left:9pt;mso-wrap-distance-top:3.6pt;mso-wrap-distance-right:9pt;mso-wrap-distance-bottom:3.6pt;mso-position-horizontal:absolute;mso-position-horizontal-relative:text;mso-position-vertical:absolute;mso-position-vertical-relative:text;mso-width-percent:400;mso-height-percent:200;mso-width-relative:margin;mso-height-relative:margin;v-text-anchor:top" o:gfxdata="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" stroked="f">
                 <v:textbox style="mso-fit-shape-to-text:t">
                   <w:txbxContent>
                     <w:p>
@@ -955,7 +1105,7 @@
         <mc:AlternateContent>
           <mc:Choice Requires="wps">
             <w:drawing>
-              <wp:anchor distT="45720" distB="45720" distL="114300" distR="114300" simplePos="0" relativeHeight="251658752" behindDoc="0" locked="0" layoutInCell="1" allowOverlap="1" wp14:anchorId="10E37718" wp14:editId="6D9DA23A">
+              <wp:anchor distT="45720" distB="45720" distL="114300" distR="114300" simplePos="0" relativeHeight="251662336" behindDoc="0" locked="0" layoutInCell="1" allowOverlap="1" wp14:anchorId="10E37718" wp14:editId="6D9DA23A">
                 <wp:simplePos x="0" y="0"/>
                 <wp:positionH relativeFrom="column">
                   <wp:posOffset>104775</wp:posOffset>
@@ -1037,7 +1187,7 @@
           </mc:Choice>
           <mc:Fallback>
             <w:pict>
-              <v:shape w14:anchorId="10E37718" id="_x0000_s1029" type="#_x0000_t202" style="position:absolute;margin-left:8.25pt;margin-top:199.4pt;width:185.9pt;height:110.6pt;flip:x;z-index:251658752;visibility:visible;mso-wrap-style:square;mso-width-percent:400;mso-height-percent:200;mso-wrap-distance-left:9pt;mso-wrap-distance-top:3.6pt;mso-wrap-distance-right:9pt;mso-wrap-distance-bottom:3.6pt;mso-position-horizontal:absolute;mso-position-horizontal-relative:text;mso-position-vertical:absolute;mso-position-vertical-relative:text;mso-width-percent:400;mso-height-percent:200;mso-width-relative:margin;mso-height-relative:margin;v-text-anchor:top" o:gfxdata="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" stroked="f">
+              <v:shape w14:anchorId="10E37718" id="_x0000_s1030" type="#_x0000_t202" style="position:absolute;margin-left:8.25pt;margin-top:199.4pt;width:185.9pt;height:110.6pt;flip:x;z-index:251662336;visibility:visible;mso-wrap-style:square;mso-width-percent:400;mso-height-percent:200;mso-wrap-distance-left:9pt;mso-wrap-distance-top:3.6pt;mso-wrap-distance-right:9pt;mso-wrap-distance-bottom:3.6pt;mso-position-horizontal:absolute;mso-position-horizontal-relative:text;mso-position-vertical:absolute;mso-position-vertical-relative:text;mso-width-percent:400;mso-height-percent:200;mso-width-relative:margin;mso-height-relative:margin;v-text-anchor:top" o:gfxdata="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" stroked="f">
                 <v:textbox style="mso-fit-shape-to-text:t">
                   <w:txbxContent>
                     <w:p>
@@ -1080,7 +1230,7 @@
         <mc:AlternateContent>
           <mc:Choice Requires="wps">
             <w:drawing>
-              <wp:anchor distT="0" distB="0" distL="114300" distR="114300" simplePos="0" relativeHeight="251652608" behindDoc="0" locked="0" layoutInCell="1" allowOverlap="1" wp14:anchorId="0A0B2530" wp14:editId="086D7763">
+              <wp:anchor distT="0" distB="0" distL="114300" distR="114300" simplePos="0" relativeHeight="251652096" behindDoc="0" locked="0" layoutInCell="1" allowOverlap="1" wp14:anchorId="0A0B2530" wp14:editId="086D7763">
                 <wp:simplePos x="0" y="0"/>
                 <wp:positionH relativeFrom="column">
                   <wp:posOffset>2223135</wp:posOffset>
@@ -1157,7 +1307,7 @@
           </mc:Choice>
           <mc:Fallback>
             <w:pict>
-              <v:roundrect w14:anchorId="0A0B2530" id="Rectangle: Rounded Corners 8" o:spid="_x0000_s1030" style="position:absolute;margin-left:175.05pt;margin-top:30.2pt;width:1in;height:36.85pt;z-index:251652608;visibility:visible;mso-wrap-style:square;mso-height-percent:0;mso-wrap-distance-left:9pt;mso-wrap-distance-top:0;mso-wrap-distance-right:9pt;mso-wrap-distance-bottom:0;mso-position-horizontal:absolute;mso-position-horizontal-relative:text;mso-position-vertical:absolute;mso-position-vertical-relative:text;mso-height-percent:0;mso-height-relative:margin;v-text-anchor:middle" arcsize="10923f" o:gfxdata="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" fillcolor="#4f81bd [3204]" strokecolor="#0a121c [484]" strokeweight="2pt">
+              <v:roundrect w14:anchorId="0A0B2530" id="Rectangle: Rounded Corners 8" o:spid="_x0000_s1031" style="position:absolute;margin-left:175.05pt;margin-top:30.2pt;width:1in;height:36.85pt;z-index:251652096;visibility:visible;mso-wrap-style:square;mso-height-percent:0;mso-wrap-distance-left:9pt;mso-wrap-distance-top:0;mso-wrap-distance-right:9pt;mso-wrap-distance-bottom:0;mso-position-horizontal:absolute;mso-position-horizontal-relative:text;mso-position-vertical:absolute;mso-position-vertical-relative:text;mso-height-percent:0;mso-height-relative:margin;v-text-anchor:middle" arcsize="10923f" o:gfxdata="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" fillcolor="#4f81bd [3204]" strokecolor="#0a121c [484]" strokeweight="2pt">
                 <v:textbox>
                   <w:txbxContent>
                     <w:p>
@@ -1191,7 +1341,7 @@
         <mc:AlternateContent>
           <mc:Choice Requires="wps">
             <w:drawing>
-              <wp:anchor distT="0" distB="0" distL="114300" distR="114300" simplePos="0" relativeHeight="251653632" behindDoc="0" locked="0" layoutInCell="1" allowOverlap="1" wp14:anchorId="4B0C41B8" wp14:editId="3E70D971">
+              <wp:anchor distT="0" distB="0" distL="114300" distR="114300" simplePos="0" relativeHeight="251654144" behindDoc="0" locked="0" layoutInCell="1" allowOverlap="1" wp14:anchorId="4B0C41B8" wp14:editId="3E70D971">
                 <wp:simplePos x="0" y="0"/>
                 <wp:positionH relativeFrom="column">
                   <wp:posOffset>3459480</wp:posOffset>
@@ -1268,7 +1418,7 @@
           </mc:Choice>
           <mc:Fallback>
             <w:pict>
-              <v:roundrect w14:anchorId="4B0C41B8" id="_x0000_s1031" style="position:absolute;margin-left:272.4pt;margin-top:30.2pt;width:1in;height:36.85pt;z-index:251653632;visibility:visible;mso-wrap-style:square;mso-height-percent:0;mso-wrap-distance-left:9pt;mso-wrap-distance-top:0;mso-wrap-distance-right:9pt;mso-wrap-distance-bottom:0;mso-position-horizontal:absolute;mso-position-horizontal-relative:text;mso-position-vertical:absolute;mso-position-vertical-relative:text;mso-height-percent:0;mso-height-relative:margin;v-text-anchor:middle" arcsize="10923f" o:gfxdata="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" fillcolor="#4f81bd [3204]" strokecolor="#0a121c [484]" strokeweight="2pt">
+              <v:roundrect w14:anchorId="4B0C41B8" id="_x0000_s1032" style="position:absolute;margin-left:272.4pt;margin-top:30.2pt;width:1in;height:36.85pt;z-index:251654144;visibility:visible;mso-wrap-style:square;mso-height-percent:0;mso-wrap-distance-left:9pt;mso-wrap-distance-top:0;mso-wrap-distance-right:9pt;mso-wrap-distance-bottom:0;mso-position-horizontal:absolute;mso-position-horizontal-relative:text;mso-position-vertical:absolute;mso-position-vertical-relative:text;mso-height-percent:0;mso-height-relative:margin;v-text-anchor:middle" arcsize="10923f" o:gfxdata="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" fillcolor="#4f81bd [3204]" strokecolor="#0a121c [484]" strokeweight="2pt">
                 <v:textbox>
                   <w:txbxContent>
                     <w:p>
@@ -1302,7 +1452,7 @@
         <mc:AlternateContent>
           <mc:Choice Requires="wps">
             <w:drawing>
-              <wp:anchor distT="0" distB="0" distL="114300" distR="114300" simplePos="0" relativeHeight="251654656" behindDoc="0" locked="0" layoutInCell="1" allowOverlap="1" wp14:anchorId="31939CC7" wp14:editId="58F2F284">
+              <wp:anchor distT="0" distB="0" distL="114300" distR="114300" simplePos="0" relativeHeight="251656192" behindDoc="0" locked="0" layoutInCell="1" allowOverlap="1" wp14:anchorId="31939CC7" wp14:editId="58F2F284">
                 <wp:simplePos x="0" y="0"/>
                 <wp:positionH relativeFrom="column">
                   <wp:posOffset>536030</wp:posOffset>
@@ -1351,7 +1501,7 @@
           </mc:Choice>
           <mc:Fallback>
             <w:pict>
-              <v:line w14:anchorId="44635AC2" id="Straight Connector 9" o:spid="_x0000_s1026" style="position:absolute;z-index:251654656;visibility:visible;mso-wrap-style:square;mso-wrap-distance-left:9pt;mso-wrap-distance-top:0;mso-wrap-distance-right:9pt;mso-wrap-distance-bottom:0;mso-position-horizontal:absolute;mso-position-horizontal-relative:text;mso-position-vertical:absolute;mso-position-vertical-relative:text" from="42.2pt,235.85pt" to="175.05pt,235.85pt" o:gfxdata="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" strokecolor="black [3200]" strokeweight="3pt">
+              <v:line w14:anchorId="12219C38" id="Straight Connector 9" o:spid="_x0000_s1026" style="position:absolute;left:0;text-align:left;z-index:251656192;visibility:visible;mso-wrap-style:square;mso-wrap-distance-left:9pt;mso-wrap-distance-top:0;mso-wrap-distance-right:9pt;mso-wrap-distance-bottom:0;mso-position-horizontal:absolute;mso-position-horizontal-relative:text;mso-position-vertical:absolute;mso-position-vertical-relative:text" from="42.2pt,235.85pt" to="175.05pt,235.85pt" o:gfxdata="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" strokecolor="black [3200]" strokeweight="3pt">
                 <v:shadow on="t" color="black" opacity="22937f" origin=",.5" offset="0,.63889mm"/>
               </v:line>
             </w:pict>
@@ -1368,7 +1518,7 @@
         <mc:AlternateContent>
           <mc:Choice Requires="wps">
             <w:drawing>
-              <wp:anchor distT="0" distB="0" distL="114300" distR="114300" simplePos="0" relativeHeight="251657728" behindDoc="0" locked="0" layoutInCell="1" allowOverlap="1" wp14:anchorId="7875B88C" wp14:editId="57857D5A">
+              <wp:anchor distT="0" distB="0" distL="114300" distR="114300" simplePos="0" relativeHeight="251660288" behindDoc="0" locked="0" layoutInCell="1" allowOverlap="1" wp14:anchorId="7875B88C" wp14:editId="57857D5A">
                 <wp:simplePos x="0" y="0"/>
                 <wp:positionH relativeFrom="column">
                   <wp:posOffset>4604385</wp:posOffset>
@@ -1417,7 +1567,7 @@
           </mc:Choice>
           <mc:Fallback>
             <w:pict>
-              <v:line w14:anchorId="79C5AD35" id="Straight Connector 9" o:spid="_x0000_s1026" style="position:absolute;z-index:251657728;visibility:visible;mso-wrap-style:square;mso-wrap-distance-left:9pt;mso-wrap-distance-top:0;mso-wrap-distance-right:9pt;mso-wrap-distance-bottom:0;mso-position-horizontal:absolute;mso-position-horizontal-relative:text;mso-position-vertical:absolute;mso-position-vertical-relative:text" from="362.55pt,235.95pt" to="495.4pt,235.95pt" o:gfxdata="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" strokecolor="black [3200]" strokeweight="3pt">
+              <v:line w14:anchorId="143A7F00" id="Straight Connector 9" o:spid="_x0000_s1026" style="position:absolute;left:0;text-align:left;z-index:251660288;visibility:visible;mso-wrap-style:square;mso-wrap-distance-left:9pt;mso-wrap-distance-top:0;mso-wrap-distance-right:9pt;mso-wrap-distance-bottom:0;mso-position-horizontal:absolute;mso-position-horizontal-relative:text;mso-position-vertical:absolute;mso-position-vertical-relative:text" from="362.55pt,235.95pt" to="495.4pt,235.95pt" o:gfxdata="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" strokecolor="black [3200]" strokeweight="3pt">
                 <v:shadow on="t" color="black" opacity="22937f" origin=",.5" offset="0,.63889mm"/>
               </v:line>
             </w:pict>
@@ -1432,7 +1582,7 @@
           <w:szCs w:val="36"/>
         </w:rPr>
         <w:drawing>
-          <wp:anchor distT="0" distB="0" distL="114300" distR="114300" simplePos="0" relativeHeight="251650560" behindDoc="0" locked="0" layoutInCell="1" allowOverlap="1" wp14:anchorId="2AFFD219" wp14:editId="35932DFC">
+          <wp:anchor distT="0" distB="0" distL="114300" distR="114300" simplePos="0" relativeHeight="251648000" behindDoc="0" locked="0" layoutInCell="1" allowOverlap="1" wp14:anchorId="2AFFD219" wp14:editId="35932DFC">
             <wp:simplePos x="0" y="0"/>
             <wp:positionH relativeFrom="column">
               <wp:posOffset>4607016</wp:posOffset>
@@ -1504,7 +1654,7 @@
         <mc:AlternateContent>
           <mc:Choice Requires="wps">
             <w:drawing>
-              <wp:anchor distT="0" distB="0" distL="114300" distR="114300" simplePos="0" relativeHeight="251656704" behindDoc="0" locked="0" layoutInCell="1" allowOverlap="1" wp14:anchorId="0124B21A" wp14:editId="2C5AAED1">
+              <wp:anchor distT="0" distB="0" distL="114300" distR="114300" simplePos="0" relativeHeight="251658240" behindDoc="0" locked="0" layoutInCell="1" allowOverlap="1" wp14:anchorId="0124B21A" wp14:editId="1231FE22">
                 <wp:simplePos x="0" y="0"/>
                 <wp:positionH relativeFrom="column">
                   <wp:posOffset>4607288</wp:posOffset>
@@ -1553,7 +1703,7 @@
           </mc:Choice>
           <mc:Fallback>
             <w:pict>
-              <v:line w14:anchorId="761FF35B" id="Straight Connector 9" o:spid="_x0000_s1026" style="position:absolute;z-index:251656704;visibility:visible;mso-wrap-style:square;mso-wrap-distance-left:9pt;mso-wrap-distance-top:0;mso-wrap-distance-right:9pt;mso-wrap-distance-bottom:0;mso-position-horizontal:absolute;mso-position-horizontal-relative:text;mso-position-vertical:absolute;mso-position-vertical-relative:text" from="362.8pt,403.5pt" to="495.65pt,403.5pt" o:gfxdata="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" strokecolor="black [3200]" strokeweight="3pt">
+              <v:line w14:anchorId="0DA47709" id="Straight Connector 9" o:spid="_x0000_s1026" style="position:absolute;left:0;text-align:left;z-index:251658240;visibility:visible;mso-wrap-style:square;mso-wrap-distance-left:9pt;mso-wrap-distance-top:0;mso-wrap-distance-right:9pt;mso-wrap-distance-bottom:0;mso-position-horizontal:absolute;mso-position-horizontal-relative:text;mso-position-vertical:absolute;mso-position-vertical-relative:text" from="362.8pt,403.5pt" to="495.65pt,403.5pt" o:gfxdata="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" strokecolor="black [3200]" strokeweight="3pt">
                 <v:shadow on="t" color="black" opacity="22937f" origin=",.5" offset="0,.63889mm"/>
               </v:line>
             </w:pict>
@@ -1570,137 +1720,7 @@
         <mc:AlternateContent>
           <mc:Choice Requires="wps">
             <w:drawing>
-              <wp:anchor distT="45720" distB="45720" distL="114300" distR="114300" simplePos="0" relativeHeight="251648512" behindDoc="0" locked="0" layoutInCell="1" allowOverlap="1" wp14:anchorId="20D99B0E" wp14:editId="45C5A47E">
-                <wp:simplePos x="0" y="0"/>
-                <wp:positionH relativeFrom="column">
-                  <wp:posOffset>1958975</wp:posOffset>
-                </wp:positionH>
-                <wp:positionV relativeFrom="paragraph">
-                  <wp:posOffset>5424352</wp:posOffset>
-                </wp:positionV>
-                <wp:extent cx="2360930" cy="1404620"/>
-                <wp:effectExtent l="0" t="0" r="19050" b="24130"/>
-                <wp:wrapNone/>
-                <wp:docPr id="217" name="Text Box 2"/>
-                <wp:cNvGraphicFramePr>
-                  <a:graphicFrameLocks xmlns:a="http://schemas.openxmlformats.org/drawingml/2006/main"/>
-                </wp:cNvGraphicFramePr>
-                <a:graphic xmlns:a="http://schemas.openxmlformats.org/drawingml/2006/main">
-                  <a:graphicData uri="http://schemas.microsoft.com/office/word/2010/wordprocessingShape">
-                    <wps:wsp>
-                      <wps:cNvSpPr txBox="1">
-                        <a:spLocks noChangeArrowheads="1"/>
-                      </wps:cNvSpPr>
-                      <wps:spPr bwMode="auto">
-                        <a:xfrm>
-                          <a:off x="0" y="0"/>
-                          <a:ext cx="2360930" cy="1404620"/>
-                        </a:xfrm>
-                        <a:prstGeom prst="rect">
-                          <a:avLst/>
-                        </a:prstGeom>
-                        <a:solidFill>
-                          <a:srgbClr val="FFFFFF"/>
-                        </a:solidFill>
-                        <a:ln w="9525">
-                          <a:solidFill>
-                            <a:srgbClr val="000000"/>
-                          </a:solidFill>
-                          <a:miter lim="800000"/>
-                          <a:headEnd/>
-                          <a:tailEnd/>
-                        </a:ln>
-                      </wps:spPr>
-                      <wps:txbx>
-                        <w:txbxContent>
-                          <w:p>
-                            <w:pPr>
-                              <w:bidi w:val="0"/>
-                              <w:jc w:val="center"/>
-                              <w:rPr>
-                                <w:rFonts w:ascii="Lucida Bright" w:hAnsi="Lucida Bright"/>
-                                <w:b/>
-                                <w:bCs/>
-                                <w:sz w:val="72"/>
-                                <w:szCs w:val="72"/>
-                              </w:rPr>
-                            </w:pPr>
-                            <w:r>
-                              <w:rPr>
-                                <w:rFonts w:ascii="Lucida Bright" w:hAnsi="Lucida Bright"/>
-                                <w:b/>
-                                <w:bCs/>
-                                <w:sz w:val="72"/>
-                                <w:szCs w:val="72"/>
-                              </w:rPr>
-                              <w:t>Good Luck</w:t>
-                            </w:r>
-                          </w:p>
-                          <w:p/>
-                        </w:txbxContent>
-                      </wps:txbx>
-                      <wps:bodyPr rot="0" vert="horz" wrap="square" lIns="91440" tIns="45720" rIns="91440" bIns="45720" anchor="t" anchorCtr="0">
-                        <a:spAutoFit/>
-                      </wps:bodyPr>
-                    </wps:wsp>
-                  </a:graphicData>
-                </a:graphic>
-                <wp14:sizeRelH relativeFrom="margin">
-                  <wp14:pctWidth>40000</wp14:pctWidth>
-                </wp14:sizeRelH>
-                <wp14:sizeRelV relativeFrom="margin">
-                  <wp14:pctHeight>20000</wp14:pctHeight>
-                </wp14:sizeRelV>
-              </wp:anchor>
-            </w:drawing>
-          </mc:Choice>
-          <mc:Fallback>
-            <w:pict>
-              <v:shape w14:anchorId="20D99B0E" id="Text Box 2" o:spid="_x0000_s1032" type="#_x0000_t202" style="position:absolute;margin-left:154.25pt;margin-top:427.1pt;width:185.9pt;height:110.6pt;z-index:251648512;visibility:visible;mso-wrap-style:square;mso-width-percent:400;mso-height-percent:200;mso-wrap-distance-left:9pt;mso-wrap-distance-top:3.6pt;mso-wrap-distance-right:9pt;mso-wrap-distance-bottom:3.6pt;mso-position-horizontal:absolute;mso-position-horizontal-relative:text;mso-position-vertical:absolute;mso-position-vertical-relative:text;mso-width-percent:400;mso-height-percent:200;mso-width-relative:margin;mso-height-relative:margin;v-text-anchor:top" o:gfxdata="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">
-                <v:textbox style="mso-fit-shape-to-text:t">
-                  <w:txbxContent>
-                    <w:p>
-                      <w:pPr>
-                        <w:bidi w:val="0"/>
-                        <w:jc w:val="center"/>
-                        <w:rPr>
-                          <w:rFonts w:ascii="Lucida Bright" w:hAnsi="Lucida Bright"/>
-                          <w:b/>
-                          <w:bCs/>
-                          <w:sz w:val="72"/>
-                          <w:szCs w:val="72"/>
-                        </w:rPr>
-                      </w:pPr>
-                      <w:r>
-                        <w:rPr>
-                          <w:rFonts w:ascii="Lucida Bright" w:hAnsi="Lucida Bright"/>
-                          <w:b/>
-                          <w:bCs/>
-                          <w:sz w:val="72"/>
-                          <w:szCs w:val="72"/>
-                        </w:rPr>
-                        <w:t>Good Luck</w:t>
-                      </w:r>
-                    </w:p>
-                    <w:p/>
-                  </w:txbxContent>
-                </v:textbox>
-              </v:shape>
-            </w:pict>
-          </mc:Fallback>
-        </mc:AlternateContent>
-      </w:r>
-      <w:r>
-        <w:rPr>
-          <w:rFonts w:ascii="Lucida Bright" w:hAnsi="Lucida Bright"/>
-          <w:noProof/>
-          <w:sz w:val="36"/>
-          <w:szCs w:val="36"/>
-        </w:rPr>
-        <mc:AlternateContent>
-          <mc:Choice Requires="wps">
-            <w:drawing>
-              <wp:anchor distT="0" distB="0" distL="114300" distR="114300" simplePos="0" relativeHeight="251655680" behindDoc="0" locked="0" layoutInCell="1" allowOverlap="1" wp14:anchorId="7285D0FD" wp14:editId="61FF408C">
+              <wp:anchor distT="0" distB="0" distL="114300" distR="114300" simplePos="0" relativeHeight="251656704" behindDoc="0" locked="0" layoutInCell="1" allowOverlap="1" wp14:anchorId="7285D0FD" wp14:editId="61FF408C">
                 <wp:simplePos x="0" y="0"/>
                 <wp:positionH relativeFrom="column">
                   <wp:posOffset>601345</wp:posOffset>
@@ -1749,7 +1769,7 @@
           </mc:Choice>
           <mc:Fallback>
             <w:pict>
-              <v:line w14:anchorId="5A66D34D" id="Straight Connector 9" o:spid="_x0000_s1026" style="position:absolute;z-index:251655680;visibility:visible;mso-wrap-style:square;mso-wrap-distance-left:9pt;mso-wrap-distance-top:0;mso-wrap-distance-right:9pt;mso-wrap-distance-bottom:0;mso-position-horizontal:absolute;mso-position-horizontal-relative:text;mso-position-vertical:absolute;mso-position-vertical-relative:text" from="47.35pt,403.5pt" to="180.2pt,403.5pt" o:gfxdata="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" strokecolor="black [3200]" strokeweight="3pt">
+              <v:line w14:anchorId="21E1D4E1" id="Straight Connector 9" o:spid="_x0000_s1026" style="position:absolute;left:0;text-align:left;z-index:251656704;visibility:visible;mso-wrap-style:square;mso-wrap-distance-left:9pt;mso-wrap-distance-top:0;mso-wrap-distance-right:9pt;mso-wrap-distance-bottom:0;mso-position-horizontal:absolute;mso-position-horizontal-relative:text;mso-position-vertical:absolute;mso-position-vertical-relative:text" from="47.35pt,403.5pt" to="180.2pt,403.5pt" o:gfxdata="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" strokecolor="black [3200]" strokeweight="3pt">
                 <v:shadow on="t" color="black" opacity="22937f" origin=",.5" offset="0,.63889mm"/>
               </v:line>
             </w:pict>
@@ -1764,7 +1784,7 @@
           <w:szCs w:val="36"/>
         </w:rPr>
         <w:drawing>
-          <wp:anchor distT="0" distB="0" distL="114300" distR="114300" simplePos="0" relativeHeight="251649536" behindDoc="0" locked="0" layoutInCell="1" allowOverlap="1" wp14:anchorId="35759F31" wp14:editId="29FFA448">
+          <wp:anchor distT="0" distB="0" distL="114300" distR="114300" simplePos="0" relativeHeight="251650560" behindDoc="0" locked="0" layoutInCell="1" allowOverlap="1" wp14:anchorId="35759F31" wp14:editId="29FFA448">
             <wp:simplePos x="0" y="0"/>
             <wp:positionH relativeFrom="column">
               <wp:posOffset>655683</wp:posOffset>
@@ -1834,7 +1854,7 @@
           <w:szCs w:val="36"/>
         </w:rPr>
         <w:drawing>
-          <wp:anchor distT="0" distB="0" distL="114300" distR="114300" simplePos="0" relativeHeight="251655680" behindDoc="0" locked="0" layoutInCell="1" allowOverlap="1" wp14:anchorId="36E6624E" wp14:editId="06C221C8">
+          <wp:anchor distT="0" distB="0" distL="114300" distR="114300" simplePos="0" relativeHeight="251657728" behindDoc="0" locked="0" layoutInCell="1" allowOverlap="1" wp14:anchorId="36E6624E" wp14:editId="06C221C8">
             <wp:simplePos x="0" y="0"/>
             <wp:positionH relativeFrom="column">
               <wp:posOffset>4541611</wp:posOffset>
@@ -1906,7 +1926,7 @@
         <mc:AlternateContent>
           <mc:Choice Requires="wps">
             <w:drawing>
-              <wp:anchor distT="0" distB="0" distL="114300" distR="114300" simplePos="0" relativeHeight="251659776" behindDoc="0" locked="0" layoutInCell="1" allowOverlap="1" wp14:anchorId="2591037B" wp14:editId="0302A268">
+              <wp:anchor distT="0" distB="0" distL="114300" distR="114300" simplePos="0" relativeHeight="251662848" behindDoc="0" locked="0" layoutInCell="1" allowOverlap="1" wp14:anchorId="2591037B" wp14:editId="0302A268">
                 <wp:simplePos x="0" y="0"/>
                 <wp:positionH relativeFrom="column">
                   <wp:posOffset>4788535</wp:posOffset>
@@ -1983,7 +2003,7 @@
           </mc:Choice>
           <mc:Fallback>
             <w:pict>
-              <v:roundrect w14:anchorId="2591037B" id="_x0000_s1033" style="position:absolute;margin-left:377.05pt;margin-top:30.2pt;width:1in;height:36.85pt;z-index:251659776;visibility:visible;mso-wrap-style:square;mso-height-percent:0;mso-wrap-distance-left:9pt;mso-wrap-distance-top:0;mso-wrap-distance-right:9pt;mso-wrap-distance-bottom:0;mso-position-horizontal:absolute;mso-position-horizontal-relative:text;mso-position-vertical:absolute;mso-position-vertical-relative:text;mso-height-percent:0;mso-height-relative:margin;v-text-anchor:middle" arcsize="10923f" o:gfxdata="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" fillcolor="#4f81bd [3204]" strokecolor="#0a121c [484]" strokeweight="2pt">
+              <v:roundrect w14:anchorId="2591037B" id="_x0000_s1033" style="position:absolute;margin-left:377.05pt;margin-top:30.2pt;width:1in;height:36.85pt;z-index:251662848;visibility:visible;mso-wrap-style:square;mso-height-percent:0;mso-wrap-distance-left:9pt;mso-wrap-distance-top:0;mso-wrap-distance-right:9pt;mso-wrap-distance-bottom:0;mso-position-horizontal:absolute;mso-position-horizontal-relative:text;mso-position-vertical:absolute;mso-position-vertical-relative:text;mso-height-percent:0;mso-height-relative:margin;v-text-anchor:middle" arcsize="10923f" o:gfxdata="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" fillcolor="#4f81bd [3204]" strokecolor="#0a121c [484]" strokeweight="2pt">
                 <v:textbox>
                   <w:txbxContent>
                     <w:p>
@@ -2017,7 +2037,7 @@
         <mc:AlternateContent>
           <mc:Choice Requires="wps">
             <w:drawing>
-              <wp:anchor distT="0" distB="0" distL="114300" distR="114300" simplePos="0" relativeHeight="251656704" behindDoc="0" locked="0" layoutInCell="1" allowOverlap="1" wp14:anchorId="688EA53D" wp14:editId="6F550D70">
+              <wp:anchor distT="0" distB="0" distL="114300" distR="114300" simplePos="0" relativeHeight="251658752" behindDoc="0" locked="0" layoutInCell="1" allowOverlap="1" wp14:anchorId="688EA53D" wp14:editId="6F550D70">
                 <wp:simplePos x="0" y="0"/>
                 <wp:positionH relativeFrom="column">
                   <wp:posOffset>902970</wp:posOffset>
@@ -2094,7 +2114,7 @@
           </mc:Choice>
           <mc:Fallback>
             <w:pict>
-              <v:roundrect w14:anchorId="688EA53D" id="_x0000_s1034" style="position:absolute;margin-left:71.1pt;margin-top:30.2pt;width:1in;height:36.85pt;z-index:251656704;visibility:visible;mso-wrap-style:square;mso-height-percent:0;mso-wrap-distance-left:9pt;mso-wrap-distance-top:0;mso-wrap-distance-right:9pt;mso-wrap-distance-bottom:0;mso-position-horizontal:absolute;mso-position-horizontal-relative:text;mso-position-vertical:absolute;mso-position-vertical-relative:text;mso-height-percent:0;mso-height-relative:margin;v-text-anchor:middle" arcsize="10923f" o:gfxdata="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" fillcolor="#4f81bd [3204]" strokecolor="#0a121c [484]" strokeweight="2pt">
+              <v:roundrect w14:anchorId="688EA53D" id="_x0000_s1034" style="position:absolute;margin-left:71.1pt;margin-top:30.2pt;width:1in;height:36.85pt;z-index:251658752;visibility:visible;mso-wrap-style:square;mso-height-percent:0;mso-wrap-distance-left:9pt;mso-wrap-distance-top:0;mso-wrap-distance-right:9pt;mso-wrap-distance-bottom:0;mso-position-horizontal:absolute;mso-position-horizontal-relative:text;mso-position-vertical:absolute;mso-position-vertical-relative:text;mso-height-percent:0;mso-height-relative:margin;v-text-anchor:middle" arcsize="10923f" o:gfxdata="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" fillcolor="#4f81bd [3204]" strokecolor="#0a121c [484]" strokeweight="2pt">
                 <v:textbox>
                   <w:txbxContent>
                     <w:p>
@@ -2178,7 +2198,7 @@
 <w:hdr xmlns:wpc="http://schemas.microsoft.com/office/word/2010/wordprocessingCanvas" xmlns:cx="http://schemas.microsoft.com/office/drawing/2014/chartex" xmlns:cx1="http://schemas.microsoft.com/office/drawing/2015/9/8/chartex" xmlns:cx2="http://schemas.microsoft.com/office/drawing/2015/10/21/chartex" xmlns:cx3="http://schemas.microsoft.com/office/drawing/2016/5/9/chartex" xmlns:cx4="http://schemas.microsoft.com/office/drawing/2016/5/10/chartex" xmlns:cx5="http://schemas.microsoft.com/office/drawing/2016/5/11/chartex" xmlns:cx6="http://schemas.microsoft.com/office/drawing/2016/5/12/chartex" xmlns:cx7="http://schemas.microsoft.com/office/drawing/2016/5/13/chartex" xmlns:cx8="http://schemas.microsoft.com/office/drawing/2016/5/14/chartex" xmlns:mc="http://schemas.openxmlformats.org/markup-compatibility/2006" xmlns:aink="http://schemas.microsoft.com/office/drawing/2016/ink" xmlns:am3d="http://schemas.microsoft.com/office/drawing/2017/model3d" xmlns:o="urn:schemas-microsoft-com:office:office" xmlns:oel="http://schemas.microsoft.com/office/2019/extlst" xmlns:r="http://schemas.openxmlformats.org/officeDocument/2006/relationships" xmlns:m="http://schemas.openxmlformats.org/officeDocument/2006/math" xmlns:v="urn:schemas-microsoft-com:vml" xmlns:wp14="http://schemas.microsoft.com/office/word/2010/wordprocessingDrawing" xmlns:wp="http://schemas.openxmlformats.org/drawingml/2006/wordprocessingDrawing" xmlns:w10="urn:schemas-microsoft-com:office:word" xmlns:w="http://schemas.openxmlformats.org/wordprocessingml/2006/main" xmlns:w14="http://schemas.microsoft.com/office/word/2010/wordml" xmlns:w15="http://schemas.microsoft.com/office/word/2012/wordml" xmlns:w16cex="http://schemas.microsoft.com/office/word/2018/wordml/cex" xmlns:w16cid="http://schemas.microsoft.com/office/word/2016/wordml/cid" xmlns:w16="http://schemas.microsoft.com/office/word/2018/wordml" xmlns:w16du="http://schemas.microsoft.com/office/word/2023/wordml/word16du" xmlns:w16sdtdh="http://schemas.microsoft.com/office/word/2020/wordml/sdtdatahash" xmlns:w16sdtfl="http://schemas.microsoft.com/office/word/2024/wordml/sdtformatlock" xmlns:w16se="http://schemas.microsoft.com/office/word/2015/wordml/symex" xmlns:wpg="http://schemas.microsoft.com/office/word/2010/wordprocessingGroup" xmlns:wpi="http://schemas.microsoft.com/office/word/2010/wordprocessingInk" xmlns:wne="http://schemas.microsoft.com/office/word/2006/wordml" xmlns:wps="http://schemas.microsoft.com/office/word/2010/wordprocessingShape" mc:Ignorable="w14 w15 w16se w16cid w16 w16cex w16sdtdh w16sdtfl w16du wp14">
   <w:p>
     <w:pPr>
-      <w:pStyle w:val="a4"/>
+      <w:pStyle w:val="Header"/>
     </w:pPr>
     <w:r>
       <w:rPr>
@@ -2626,7 +2646,7 @@
     <w:lsdException w:name="Unresolved Mention" w:semiHidden="1" w:unhideWhenUsed="1"/>
     <w:lsdException w:name="Smart Link" w:semiHidden="1" w:unhideWhenUsed="1"/>
   </w:latentStyles>
-  <w:style w:type="paragraph" w:default="1" w:styleId="a">
+  <w:style w:type="paragraph" w:default="1" w:styleId="Normal">
     <w:name w:val="Normal"/>
     <w:qFormat/>
     <w:rsid w:val="008F6702"/>
@@ -2640,13 +2660,13 @@
       <w:szCs w:val="24"/>
     </w:rPr>
   </w:style>
-  <w:style w:type="character" w:default="1" w:styleId="a0">
+  <w:style w:type="character" w:default="1" w:styleId="DefaultParagraphFont">
     <w:name w:val="Default Paragraph Font"/>
     <w:uiPriority w:val="1"/>
     <w:semiHidden/>
     <w:unhideWhenUsed/>
   </w:style>
-  <w:style w:type="table" w:default="1" w:styleId="a1">
+  <w:style w:type="table" w:default="1" w:styleId="TableNormal">
     <w:name w:val="Normal Table"/>
     <w:uiPriority w:val="99"/>
     <w:semiHidden/>
@@ -2661,16 +2681,16 @@
       </w:tblCellMar>
     </w:tblPr>
   </w:style>
-  <w:style w:type="numbering" w:default="1" w:styleId="a2">
+  <w:style w:type="numbering" w:default="1" w:styleId="NoList">
     <w:name w:val="No List"/>
     <w:uiPriority w:val="99"/>
     <w:semiHidden/>
     <w:unhideWhenUsed/>
   </w:style>
-  <w:style w:type="paragraph" w:styleId="a3">
+  <w:style w:type="paragraph" w:styleId="BalloonText">
     <w:name w:val="Balloon Text"/>
-    <w:basedOn w:val="a"/>
-    <w:link w:val="Char"/>
+    <w:basedOn w:val="Normal"/>
+    <w:link w:val="BalloonTextChar"/>
     <w:uiPriority w:val="99"/>
     <w:semiHidden/>
     <w:unhideWhenUsed/>
@@ -2684,10 +2704,10 @@
       <w:szCs w:val="16"/>
     </w:rPr>
   </w:style>
-  <w:style w:type="character" w:customStyle="1" w:styleId="Char">
-    <w:name w:val="نص في بالون Char"/>
-    <w:basedOn w:val="a0"/>
-    <w:link w:val="a3"/>
+  <w:style w:type="character" w:customStyle="1" w:styleId="BalloonTextChar">
+    <w:name w:val="Balloon Text Char"/>
+    <w:basedOn w:val="DefaultParagraphFont"/>
+    <w:link w:val="BalloonText"/>
     <w:uiPriority w:val="99"/>
     <w:semiHidden/>
     <w:rsid w:val="003D0CC3"/>
@@ -2697,10 +2717,10 @@
       <w:szCs w:val="16"/>
     </w:rPr>
   </w:style>
-  <w:style w:type="paragraph" w:styleId="a4">
+  <w:style w:type="paragraph" w:styleId="Header">
     <w:name w:val="header"/>
-    <w:basedOn w:val="a"/>
-    <w:link w:val="Char0"/>
+    <w:basedOn w:val="Normal"/>
+    <w:link w:val="HeaderChar"/>
     <w:uiPriority w:val="99"/>
     <w:unhideWhenUsed/>
     <w:rsid w:val="003D0CC3"/>
@@ -2717,17 +2737,17 @@
       <w:szCs w:val="22"/>
     </w:rPr>
   </w:style>
-  <w:style w:type="character" w:customStyle="1" w:styleId="Char0">
-    <w:name w:val="رأس الصفحة Char"/>
-    <w:basedOn w:val="a0"/>
-    <w:link w:val="a4"/>
+  <w:style w:type="character" w:customStyle="1" w:styleId="HeaderChar">
+    <w:name w:val="Header Char"/>
+    <w:basedOn w:val="DefaultParagraphFont"/>
+    <w:link w:val="Header"/>
     <w:uiPriority w:val="99"/>
     <w:rsid w:val="003D0CC3"/>
   </w:style>
-  <w:style w:type="paragraph" w:styleId="a5">
+  <w:style w:type="paragraph" w:styleId="Footer">
     <w:name w:val="footer"/>
-    <w:basedOn w:val="a"/>
-    <w:link w:val="Char1"/>
+    <w:basedOn w:val="Normal"/>
+    <w:link w:val="FooterChar"/>
     <w:uiPriority w:val="99"/>
     <w:unhideWhenUsed/>
     <w:rsid w:val="003D0CC3"/>
@@ -2744,16 +2764,16 @@
       <w:szCs w:val="22"/>
     </w:rPr>
   </w:style>
-  <w:style w:type="character" w:customStyle="1" w:styleId="Char1">
-    <w:name w:val="تذييل الصفحة Char"/>
-    <w:basedOn w:val="a0"/>
-    <w:link w:val="a5"/>
+  <w:style w:type="character" w:customStyle="1" w:styleId="FooterChar">
+    <w:name w:val="Footer Char"/>
+    <w:basedOn w:val="DefaultParagraphFont"/>
+    <w:link w:val="Footer"/>
     <w:uiPriority w:val="99"/>
     <w:rsid w:val="003D0CC3"/>
   </w:style>
-  <w:style w:type="table" w:styleId="a6">
+  <w:style w:type="table" w:styleId="TableGrid">
     <w:name w:val="Table Grid"/>
-    <w:basedOn w:val="a1"/>
+    <w:basedOn w:val="TableNormal"/>
     <w:uiPriority w:val="59"/>
     <w:rsid w:val="00AB3A99"/>
     <w:pPr>

</xml_diff>